<commit_message>
Séparer les paragraphes du corps des courriers
Les balises de boucle étaient dans un seul paragraphe Word : le corps sortait
en un bloc. Test ajouté.

Co-Authored-By: Claude Opus 5.5 <noreply@anthropic.com>
</commit_message>
<xml_diff>
--- a/templates/courrier.docx
+++ b/templates/courrier.docx
@@ -108,13 +108,35 @@
     </w:p>
     <w:p>
       <w:pPr>
+        <w:spacing w:after="0"/>
+      </w:pPr>
+      <w:r>
+        <w:rPr>
+          <w:sz w:val="20"/>
+        </w:rPr>
+        <w:t xml:space="preserve">{#paragraphes}</w:t>
+      </w:r>
+    </w:p>
+    <w:p>
+      <w:pPr>
         <w:spacing w:after="160"/>
       </w:pPr>
       <w:r>
         <w:rPr>
           <w:sz w:val="20"/>
         </w:rPr>
-        <w:t xml:space="preserve">{#paragraphes}{texte}{/paragraphes}</w:t>
+        <w:t xml:space="preserve">{texte}</w:t>
+      </w:r>
+    </w:p>
+    <w:p>
+      <w:pPr>
+        <w:spacing w:after="0"/>
+      </w:pPr>
+      <w:r>
+        <w:rPr>
+          <w:sz w:val="20"/>
+        </w:rPr>
+        <w:t xml:space="preserve">{/paragraphes}</w:t>
       </w:r>
     </w:p>
     <w:p>

</xml_diff>

<commit_message>
Corriger l'en-tête des devis, factures, reçus et courriers (XML mal formé)
Le remplacement de « USA CARS » par le logo cherchait le début du run avec
« <w:r », qui trouvait aussi « <w:rPr> » : la balise <w:r> restait ouverte et
Word refusait d'ouvrir les fichiers générés depuis l'ajout du logo (lot 3b).
Le script vérifie désormais la structure XML de chaque modèle, et les tests
celle de chaque document généré.

Co-Authored-By: Claude Opus 5.5 <noreply@anthropic.com>
</commit_message>
<xml_diff>
--- a/templates/courrier.docx
+++ b/templates/courrier.docx
@@ -284,8 +284,75 @@
 </w:footnotes>
 </file>
 
-<file path=word/header1.xml><?xml version="1.0" encoding="UTF-8" standalone="yes"?>
-<w:hdr xmlns:wpc="http://schemas.microsoft.com/office/word/2010/wordprocessingCanvas" xmlns:cx="http://schemas.microsoft.com/office/drawing/2014/chartex" xmlns:cx1="http://schemas.microsoft.com/office/drawing/2015/9/8/chartex" xmlns:cx2="http://schemas.microsoft.com/office/drawing/2015/10/21/chartex" xmlns:cx3="http://schemas.microsoft.com/office/drawing/2016/5/9/chartex" xmlns:cx4="http://schemas.microsoft.com/office/drawing/2016/5/10/chartex" xmlns:cx5="http://schemas.microsoft.com/office/drawing/2016/5/11/chartex" xmlns:cx6="http://schemas.microsoft.com/office/drawing/2016/5/12/chartex" xmlns:cx7="http://schemas.microsoft.com/office/drawing/2016/5/13/chartex" xmlns:cx8="http://schemas.microsoft.com/office/drawing/2016/5/14/chartex" xmlns:mc="http://schemas.openxmlformats.org/markup-compatibility/2006" xmlns:aink="http://schemas.microsoft.com/office/drawing/2016/ink" xmlns:am3d="http://schemas.microsoft.com/office/drawing/2017/model3d" xmlns:o="urn:schemas-microsoft-com:office:office" xmlns:oel="http://schemas.microsoft.com/office/2019/extlst" xmlns:r="http://schemas.openxmlformats.org/officeDocument/2006/relationships" xmlns:m="http://schemas.openxmlformats.org/officeDocument/2006/math" xmlns:v="urn:schemas-microsoft-com:vml" xmlns:wp14="http://schemas.microsoft.com/office/word/2010/wordprocessingDrawing" xmlns:wp="http://schemas.openxmlformats.org/drawingml/2006/wordprocessingDrawing" xmlns:w10="urn:schemas-microsoft-com:office:word" xmlns:w="http://schemas.openxmlformats.org/wordprocessingml/2006/main" xmlns:w14="http://schemas.microsoft.com/office/word/2010/wordml" xmlns:w15="http://schemas.microsoft.com/office/word/2012/wordml" xmlns:w16cex="http://schemas.microsoft.com/office/word/2018/wordml/cex" xmlns:w16cid="http://schemas.microsoft.com/office/word/2016/wordml/cid" xmlns:w16="http://schemas.microsoft.com/office/word/2018/wordml" xmlns:w16du="http://schemas.microsoft.com/office/word/2023/wordml/word16du" xmlns:w16sdtdh="http://schemas.microsoft.com/office/word/2020/wordml/sdtdatahash" xmlns:w16sdtfl="http://schemas.microsoft.com/office/word/2024/wordml/sdtformatlock" xmlns:w16se="http://schemas.microsoft.com/office/word/2015/wordml/symex" xmlns:wpg="http://schemas.microsoft.com/office/word/2010/wordprocessingGroup" xmlns:wpi="http://schemas.microsoft.com/office/word/2010/wordprocessingInk" xmlns:wne="http://schemas.microsoft.com/office/word/2006/wordml" xmlns:wps="http://schemas.microsoft.com/office/word/2010/wordprocessingShape" mc:Ignorable="w14 w15 w16se w16cid w16 w16cex w16sdtdh w16sdtfl w16du wp14"><w:p><w:pPr><w:pStyle w:val="Header"/><w:pBdr><w:bottom w:val="single" w:sz="8" w:space="1" w:color="1F4E79"/></w:pBdr></w:pPr><w:r><w:r><w:drawing><wp:inline distT="0" distB="0" distL="0" distR="0"><wp:extent cx="1371600" cy="538460"/><wp:docPr id="1001" name="Logo" descr="USA CARS"/><wp:cNvGraphicFramePr><a:graphicFrameLocks xmlns:a="http://schemas.openxmlformats.org/drawingml/2006/main" noChangeAspect="1"/></wp:cNvGraphicFramePr><a:graphic xmlns:a="http://schemas.openxmlformats.org/drawingml/2006/main"><a:graphicData uri="http://schemas.openxmlformats.org/drawingml/2006/picture"><pic:pic xmlns:pic="http://schemas.openxmlformats.org/drawingml/2006/picture"><pic:nvPicPr><pic:cNvPr id="0" name="logo-usa-cars.png"/><pic:cNvPicPr/></pic:nvPicPr><pic:blipFill><a:blip r:embed="rIdLogoUsaCars"/><a:stretch><a:fillRect/></a:stretch></pic:blipFill><pic:spPr><a:xfrm><a:off x="0" y="0"/><a:ext cx="1371600" cy="538460"/></a:xfrm><a:prstGeom prst="rect"><a:avLst/></a:prstGeom></pic:spPr></pic:pic></a:graphicData></a:graphic></wp:inline></w:drawing></w:r><w:r><w:rPr><w:color w:val="666666"/><w:sz w:val="16"/></w:rPr><w:t xml:space="preserve"> | {titre_entete}</w:t></w:r><w:r><w:rPr><w:color w:val="666666"/><w:sz w:val="16"/></w:rPr><w:t xml:space="preserve"></w:t></w:r><w:r><w:rPr><w:b/><w:color w:val="C00000"/><w:sz w:val="18"/></w:rPr><w:t xml:space="preserve">{#projet}   —   PROJET : document non validé juridiquement{/projet}</w:t></w:r></w:p></w:hdr>
+<file path=word/header1.xml><?xml version="1.0" encoding="utf-8"?>
+<w:hdr xmlns:wpc="http://schemas.microsoft.com/office/word/2010/wordprocessingCanvas" xmlns:cx="http://schemas.microsoft.com/office/drawing/2014/chartex" xmlns:cx1="http://schemas.microsoft.com/office/drawing/2015/9/8/chartex" xmlns:cx2="http://schemas.microsoft.com/office/drawing/2015/10/21/chartex" xmlns:cx3="http://schemas.microsoft.com/office/drawing/2016/5/9/chartex" xmlns:cx4="http://schemas.microsoft.com/office/drawing/2016/5/10/chartex" xmlns:cx5="http://schemas.microsoft.com/office/drawing/2016/5/11/chartex" xmlns:cx6="http://schemas.microsoft.com/office/drawing/2016/5/12/chartex" xmlns:cx7="http://schemas.microsoft.com/office/drawing/2016/5/13/chartex" xmlns:cx8="http://schemas.microsoft.com/office/drawing/2016/5/14/chartex" xmlns:mc="http://schemas.openxmlformats.org/markup-compatibility/2006" xmlns:aink="http://schemas.microsoft.com/office/drawing/2016/ink" xmlns:am3d="http://schemas.microsoft.com/office/drawing/2017/model3d" xmlns:o="urn:schemas-microsoft-com:office:office" xmlns:oel="http://schemas.microsoft.com/office/2019/extlst" xmlns:r="http://schemas.openxmlformats.org/officeDocument/2006/relationships" xmlns:m="http://schemas.openxmlformats.org/officeDocument/2006/math" xmlns:v="urn:schemas-microsoft-com:vml" xmlns:wp14="http://schemas.microsoft.com/office/word/2010/wordprocessingDrawing" xmlns:wp="http://schemas.openxmlformats.org/drawingml/2006/wordprocessingDrawing" xmlns:w10="urn:schemas-microsoft-com:office:word" xmlns:w="http://schemas.openxmlformats.org/wordprocessingml/2006/main" xmlns:w14="http://schemas.microsoft.com/office/word/2010/wordml" xmlns:w15="http://schemas.microsoft.com/office/word/2012/wordml" xmlns:w16cex="http://schemas.microsoft.com/office/word/2018/wordml/cex" xmlns:w16cid="http://schemas.microsoft.com/office/word/2016/wordml/cid" xmlns:w16="http://schemas.microsoft.com/office/word/2018/wordml" xmlns:w16du="http://schemas.microsoft.com/office/word/2023/wordml/word16du" xmlns:w16sdtdh="http://schemas.microsoft.com/office/word/2020/wordml/sdtdatahash" xmlns:w16sdtfl="http://schemas.microsoft.com/office/word/2024/wordml/sdtformatlock" xmlns:w16se="http://schemas.microsoft.com/office/word/2015/wordml/symex" xmlns:wpg="http://schemas.microsoft.com/office/word/2010/wordprocessingGroup" xmlns:wpi="http://schemas.microsoft.com/office/word/2010/wordprocessingInk" xmlns:wne="http://schemas.microsoft.com/office/word/2006/wordml" xmlns:wps="http://schemas.microsoft.com/office/word/2010/wordprocessingShape" mc:Ignorable="w14 w15 w16se w16cid w16 w16cex w16sdtdh w16sdtfl w16du wp14">
+  <w:p>
+    <w:pPr>
+      <w:pStyle w:val="Header"/>
+      <w:pBdr>
+        <w:bottom w:val="single" w:sz="8" w:space="1" w:color="1F4E79"/>
+      </w:pBdr>
+    </w:pPr>
+    <w:r>
+      <w:drawing>
+        <wp:inline distT="0" distB="0" distL="0" distR="0">
+          <wp:extent cx="1371600" cy="538460"/>
+          <wp:docPr id="1001" name="Logo" descr="USA CARS"/>
+          <wp:cNvGraphicFramePr>
+            <a:graphicFrameLocks xmlns:a="http://schemas.openxmlformats.org/drawingml/2006/main" noChangeAspect="1"/>
+          </wp:cNvGraphicFramePr>
+          <a:graphic xmlns:a="http://schemas.openxmlformats.org/drawingml/2006/main">
+            <a:graphicData uri="http://schemas.openxmlformats.org/drawingml/2006/picture">
+              <pic:pic xmlns:pic="http://schemas.openxmlformats.org/drawingml/2006/picture">
+                <pic:nvPicPr>
+                  <pic:cNvPr id="0" name="logo-usa-cars.png"/>
+                  <pic:cNvPicPr/>
+                </pic:nvPicPr>
+                <pic:blipFill>
+                  <a:blip r:embed="rIdLogoUsaCars"/>
+                  <a:stretch>
+                    <a:fillRect/>
+                  </a:stretch>
+                </pic:blipFill>
+                <pic:spPr>
+                  <a:xfrm>
+                    <a:off x="0" y="0"/>
+                    <a:ext cx="1371600" cy="538460"/>
+                  </a:xfrm>
+                  <a:prstGeom prst="rect">
+                    <a:avLst/>
+                  </a:prstGeom>
+                </pic:spPr>
+              </pic:pic>
+            </a:graphicData>
+          </a:graphic>
+        </wp:inline>
+      </w:drawing>
+    </w:r>
+    <w:r>
+      <w:rPr>
+        <w:color w:val="666666"/>
+        <w:sz w:val="16"/>
+      </w:rPr>
+      <w:t xml:space="preserve"> | {titre_entete}</w:t>
+    </w:r>
+    <w:r>
+      <w:rPr>
+        <w:color w:val="666666"/>
+        <w:sz w:val="16"/>
+      </w:rPr>
+      <w:t xml:space="preserve"/>
+    </w:r>
+    <w:r>
+      <w:rPr>
+        <w:b/>
+        <w:color w:val="C00000"/>
+        <w:sz w:val="18"/>
+      </w:rPr>
+      <w:t xml:space="preserve">{#projet}   —   PROJET : document non validé juridiquement{/projet}</w:t>
+    </w:r>
+  </w:p>
+</w:hdr>
 </file>
 
 <file path=word/numbering.xml><?xml version="1.0" encoding="utf-8"?>

</xml_diff>